<commit_message>
page and resume tweaks
</commit_message>
<xml_diff>
--- a/docs/TaylorDanielsResume.docx
+++ b/docs/TaylorDanielsResume.docx
@@ -306,6 +306,12 @@
         <w:spacing w:after="0" w:before="0" w:line="240" w:lineRule="auto"/>
         <w:ind w:left="0" w:right="0" w:firstLine="0"/>
         <w:rPr>
+          <w:sz w:val="4"/>
+          <w:szCs w:val="4"/>
+        </w:rPr>
+      </w:pPr>
+      <w:r>
+        <w:rPr>
           <w:i w:val="0"/>
           <w:iCs w:val="0"/>
           <w:smallCaps w:val="0"/>
@@ -316,8 +322,16 @@
           <w:u w:val="none"/>
           <w:shd w:fill="auto" w:val="clear"/>
           <w:vertAlign w:val="baseline"/>
-        </w:rPr>
-      </w:pPr>
+          <w:rtl w:val="0"/>
+        </w:rPr>
+        <w:t xml:space="preserve">Math PhD with expertise in </w:t>
+      </w:r>
+      <w:r>
+        <w:rPr>
+          <w:rtl w:val="0"/>
+        </w:rPr>
+        <w:t xml:space="preserve">Analytic Number Theory,</w:t>
+      </w:r>
       <w:r>
         <w:rPr>
           <w:i w:val="0"/>
@@ -332,13 +346,13 @@
           <w:vertAlign w:val="baseline"/>
           <w:rtl w:val="0"/>
         </w:rPr>
-        <w:t xml:space="preserve">Math PhD with expertise in </w:t>
-      </w:r>
-      <w:r>
-        <w:rPr>
-          <w:rtl w:val="0"/>
-        </w:rPr>
-        <w:t xml:space="preserve">Analytic Number Theory</w:t>
+        <w:t xml:space="preserve"> and experience in </w:t>
+      </w:r>
+      <w:r>
+        <w:rPr>
+          <w:rtl w:val="0"/>
+        </w:rPr>
+        <w:t xml:space="preserve">M</w:t>
       </w:r>
       <w:r>
         <w:rPr>
@@ -354,13 +368,13 @@
           <w:vertAlign w:val="baseline"/>
           <w:rtl w:val="0"/>
         </w:rPr>
-        <w:t xml:space="preserve"> and experience in </w:t>
-      </w:r>
-      <w:r>
-        <w:rPr>
-          <w:rtl w:val="0"/>
-        </w:rPr>
-        <w:t xml:space="preserve">M</w:t>
+        <w:t xml:space="preserve">athematical </w:t>
+      </w:r>
+      <w:r>
+        <w:rPr>
+          <w:rtl w:val="0"/>
+        </w:rPr>
+        <w:t xml:space="preserve">Physics and </w:t>
       </w:r>
       <w:r>
         <w:rPr>
@@ -376,13 +390,13 @@
           <w:vertAlign w:val="baseline"/>
           <w:rtl w:val="0"/>
         </w:rPr>
-        <w:t xml:space="preserve">athematical </w:t>
-      </w:r>
-      <w:r>
-        <w:rPr>
-          <w:rtl w:val="0"/>
-        </w:rPr>
-        <w:t xml:space="preserve">Physics and </w:t>
+        <w:t xml:space="preserve">programming. Currently </w:t>
+      </w:r>
+      <w:r>
+        <w:rPr>
+          <w:rtl w:val="0"/>
+        </w:rPr>
+        <w:t xml:space="preserve">developing skills in Development, Finance, and Machine Learning—</w:t>
       </w:r>
       <w:r>
         <w:rPr>
@@ -398,129 +412,14 @@
           <w:vertAlign w:val="baseline"/>
           <w:rtl w:val="0"/>
         </w:rPr>
-        <w:t xml:space="preserve">programming. Currently learning </w:t>
-      </w:r>
-      <w:r>
-        <w:rPr>
-          <w:rtl w:val="0"/>
-        </w:rPr>
-        <w:t xml:space="preserve">M</w:t>
-      </w:r>
-      <w:r>
-        <w:rPr>
-          <w:i w:val="0"/>
-          <w:iCs w:val="0"/>
-          <w:smallCaps w:val="0"/>
-          <w:strike w:val="0"/>
-          <w:color w:val="000000"/>
-          <w:sz w:val="20"/>
-          <w:szCs w:val="20"/>
-          <w:u w:val="none"/>
-          <w:shd w:fill="auto" w:val="clear"/>
-          <w:vertAlign w:val="baseline"/>
-          <w:rtl w:val="0"/>
-        </w:rPr>
-        <w:t xml:space="preserve">achine </w:t>
-      </w:r>
-      <w:r>
-        <w:rPr>
-          <w:rtl w:val="0"/>
-        </w:rPr>
-        <w:t xml:space="preserve">L</w:t>
-      </w:r>
-      <w:r>
-        <w:rPr>
-          <w:i w:val="0"/>
-          <w:iCs w:val="0"/>
-          <w:smallCaps w:val="0"/>
-          <w:strike w:val="0"/>
-          <w:color w:val="000000"/>
-          <w:sz w:val="20"/>
-          <w:szCs w:val="20"/>
-          <w:u w:val="none"/>
-          <w:shd w:fill="auto" w:val="clear"/>
-          <w:vertAlign w:val="baseline"/>
-          <w:rtl w:val="0"/>
-        </w:rPr>
-        <w:t xml:space="preserve">earning</w:t>
-      </w:r>
-      <w:r>
-        <w:rPr>
-          <w:rtl w:val="0"/>
-        </w:rPr>
-        <w:t xml:space="preserve">—</w:t>
-      </w:r>
-      <w:r>
-        <w:rPr>
-          <w:i w:val="0"/>
-          <w:iCs w:val="0"/>
-          <w:smallCaps w:val="0"/>
-          <w:strike w:val="0"/>
-          <w:color w:val="000000"/>
-          <w:sz w:val="20"/>
-          <w:szCs w:val="20"/>
-          <w:u w:val="none"/>
-          <w:shd w:fill="auto" w:val="clear"/>
-          <w:vertAlign w:val="baseline"/>
-          <w:rtl w:val="0"/>
-        </w:rPr>
         <w:t xml:space="preserve">my background </w:t>
       </w:r>
       <w:r>
         <w:rPr>
           <w:rtl w:val="0"/>
         </w:rPr>
-        <w:t xml:space="preserve">is helping me make rapid progress. Passionate about making tools that solve problems, and l</w:t>
-      </w:r>
-      <w:r>
-        <w:rPr>
-          <w:i w:val="0"/>
-          <w:iCs w:val="0"/>
-          <w:smallCaps w:val="0"/>
-          <w:strike w:val="0"/>
-          <w:color w:val="000000"/>
-          <w:sz w:val="20"/>
-          <w:szCs w:val="20"/>
-          <w:u w:val="none"/>
-          <w:shd w:fill="auto" w:val="clear"/>
-          <w:vertAlign w:val="baseline"/>
-          <w:rtl w:val="0"/>
-        </w:rPr>
-        <w:t xml:space="preserve">ooking for </w:t>
-      </w:r>
-      <w:r>
-        <w:rPr>
-          <w:rtl w:val="0"/>
-        </w:rPr>
-        <w:t xml:space="preserve">roles in Machine Learning, Simulation, Data Science, and Quant. Analysis and Development.</w:t>
-      </w:r>
-      <w:r>
-        <w:rPr>
-          <w:rtl w:val="0"/>
-        </w:rPr>
-      </w:r>
-    </w:p>
-    <w:p>
-      <w:pPr>
-        <w:keepNext w:val="0"/>
-        <w:keepLines w:val="1"/>
-        <w:pageBreakBefore w:val="0"/>
-        <w:widowControl w:val="0"/>
-        <w:pBdr>
-          <w:top w:space="0" w:sz="0" w:val="nil"/>
-          <w:left w:space="0" w:sz="0" w:val="nil"/>
-          <w:bottom w:space="0" w:sz="0" w:val="nil"/>
-          <w:right w:space="0" w:sz="0" w:val="nil"/>
-          <w:between w:space="0" w:sz="0" w:val="nil"/>
-        </w:pBdr>
-        <w:shd w:fill="auto" w:val="clear"/>
-        <w:spacing w:after="0" w:before="0" w:line="240" w:lineRule="auto"/>
-        <w:ind w:left="0" w:right="0" w:firstLine="0"/>
-        <w:rPr>
-          <w:sz w:val="4"/>
-          <w:szCs w:val="4"/>
-        </w:rPr>
-      </w:pPr>
+        <w:t xml:space="preserve">is helping me make rapid progress. Passionate about making tools that solve problems.</w:t>
+      </w:r>
       <w:r>
         <w:rPr>
           <w:rtl w:val="0"/>
@@ -603,7 +502,21 @@
           <w:szCs w:val="20"/>
           <w:rtl w:val="0"/>
         </w:rPr>
-        <w:t xml:space="preserve">, Purdue Univ., West Lafayette, IN </w:t>
+        <w:t xml:space="preserve">, Purdue Univ</w:t>
+      </w:r>
+      <w:r>
+        <w:rPr>
+          <w:rtl w:val="0"/>
+        </w:rPr>
+        <w:t xml:space="preserve">ersity</w:t>
+      </w:r>
+      <w:r>
+        <w:rPr>
+          <w:sz w:val="20"/>
+          <w:szCs w:val="20"/>
+          <w:rtl w:val="0"/>
+        </w:rPr>
+        <w:t xml:space="preserve">, West Lafayette, IN </w:t>
         <w:tab/>
       </w:r>
       <w:r>
@@ -627,7 +540,6 @@
           <w:rtl w:val="0"/>
         </w:rPr>
         <w:tab/>
-        <w:t xml:space="preserve"> </w:t>
       </w:r>
       <w:r>
         <w:rPr>
@@ -645,13 +557,7 @@
           <w:bCs w:val="1"/>
           <w:rtl w:val="0"/>
         </w:rPr>
-        <w:t xml:space="preserve">15 –</w:t>
-      </w:r>
-      <w:r>
-        <w:rPr>
-          <w:rtl w:val="0"/>
-        </w:rPr>
-        <w:t xml:space="preserve"> </w:t>
+        <w:t xml:space="preserve">15 – </w:t>
       </w:r>
       <w:r>
         <w:rPr>
@@ -716,7 +622,21 @@
           <w:szCs w:val="20"/>
           <w:rtl w:val="0"/>
         </w:rPr>
-        <w:t xml:space="preserve">, Univ. of Louisville, Louisville, KY </w:t>
+        <w:t xml:space="preserve">, Univ</w:t>
+      </w:r>
+      <w:r>
+        <w:rPr>
+          <w:rtl w:val="0"/>
+        </w:rPr>
+        <w:t xml:space="preserve">ersity</w:t>
+      </w:r>
+      <w:r>
+        <w:rPr>
+          <w:sz w:val="20"/>
+          <w:szCs w:val="20"/>
+          <w:rtl w:val="0"/>
+        </w:rPr>
+        <w:t xml:space="preserve"> of Louisville, Louisville, KY </w:t>
         <w:tab/>
       </w:r>
       <w:r>
@@ -747,15 +667,7 @@
           <w:szCs w:val="20"/>
           <w:rtl w:val="0"/>
         </w:rPr>
-        <w:t xml:space="preserve">2014 –</w:t>
-      </w:r>
-      <w:r>
-        <w:rPr>
-          <w:sz w:val="20"/>
-          <w:szCs w:val="20"/>
-          <w:rtl w:val="0"/>
-        </w:rPr>
-        <w:t xml:space="preserve"> </w:t>
+        <w:t xml:space="preserve">2014 – </w:t>
       </w:r>
       <w:r>
         <w:rPr>
@@ -819,7 +731,21 @@
           <w:szCs w:val="20"/>
           <w:rtl w:val="0"/>
         </w:rPr>
-        <w:t xml:space="preserve">, Univ. of Louisville, Louisville, KY </w:t>
+        <w:t xml:space="preserve">, Univ</w:t>
+      </w:r>
+      <w:r>
+        <w:rPr>
+          <w:rtl w:val="0"/>
+        </w:rPr>
+        <w:t xml:space="preserve">ersity</w:t>
+      </w:r>
+      <w:r>
+        <w:rPr>
+          <w:sz w:val="20"/>
+          <w:szCs w:val="20"/>
+          <w:rtl w:val="0"/>
+        </w:rPr>
+        <w:t xml:space="preserve"> of Louisville, Louisville, KY </w:t>
         <w:tab/>
       </w:r>
       <w:r>
@@ -849,7 +775,15 @@
           <w:szCs w:val="20"/>
           <w:rtl w:val="0"/>
         </w:rPr>
-        <w:t xml:space="preserve">2009 – </w:t>
+        <w:t xml:space="preserve">2009 –</w:t>
+      </w:r>
+      <w:r>
+        <w:rPr>
+          <w:sz w:val="20"/>
+          <w:szCs w:val="20"/>
+          <w:rtl w:val="0"/>
+        </w:rPr>
+        <w:t xml:space="preserve"> </w:t>
       </w:r>
       <w:r>
         <w:rPr>
@@ -1378,7 +1312,35 @@
           <w:szCs w:val="20"/>
           <w:rtl w:val="0"/>
         </w:rPr>
-        <w:t xml:space="preserve">, Purdue Univ. Mathematics </w:t>
+        <w:t xml:space="preserve">, Purdue Univ</w:t>
+      </w:r>
+      <w:r>
+        <w:rPr>
+          <w:rtl w:val="0"/>
+        </w:rPr>
+        <w:t xml:space="preserve">ersity </w:t>
+      </w:r>
+      <w:r>
+        <w:rPr>
+          <w:sz w:val="20"/>
+          <w:szCs w:val="20"/>
+          <w:rtl w:val="0"/>
+        </w:rPr>
+        <w:t xml:space="preserve">Mathematics, </w:t>
+      </w:r>
+      <w:r>
+        <w:rPr>
+          <w:rtl w:val="0"/>
+        </w:rPr>
+        <w:t xml:space="preserve">West Lafayette, IN</w:t>
+      </w:r>
+      <w:r>
+        <w:rPr>
+          <w:sz w:val="20"/>
+          <w:szCs w:val="20"/>
+          <w:rtl w:val="0"/>
+        </w:rPr>
+        <w:t xml:space="preserve"> </w:t>
         <w:tab/>
       </w:r>
       <w:r>
@@ -1479,7 +1441,34 @@
           <w:szCs w:val="20"/>
           <w:rtl w:val="0"/>
         </w:rPr>
-        <w:t xml:space="preserve">, Purdue Univ. Mathematics </w:t>
+        <w:t xml:space="preserve">, Purdue Univ</w:t>
+      </w:r>
+      <w:r>
+        <w:rPr>
+          <w:rtl w:val="0"/>
+        </w:rPr>
+        <w:t xml:space="preserve">ersity</w:t>
+      </w:r>
+      <w:r>
+        <w:rPr>
+          <w:sz w:val="20"/>
+          <w:szCs w:val="20"/>
+          <w:rtl w:val="0"/>
+        </w:rPr>
+        <w:t xml:space="preserve"> Mathematics</w:t>
+      </w:r>
+      <w:r>
+        <w:rPr>
+          <w:rtl w:val="0"/>
+        </w:rPr>
+        <w:t xml:space="preserve">, West Lafayette, IN</w:t>
+      </w:r>
+      <w:r>
+        <w:rPr>
+          <w:sz w:val="20"/>
+          <w:szCs w:val="20"/>
+          <w:rtl w:val="0"/>
+        </w:rPr>
         <w:tab/>
       </w:r>
       <w:r>
@@ -1736,7 +1725,21 @@
           <w:szCs w:val="20"/>
           <w:rtl w:val="0"/>
         </w:rPr>
-        <w:t xml:space="preserve">, Univ. of Louisville Mathematics</w:t>
+        <w:t xml:space="preserve">, Univ</w:t>
+      </w:r>
+      <w:r>
+        <w:rPr>
+          <w:rtl w:val="0"/>
+        </w:rPr>
+        <w:t xml:space="preserve">ersity</w:t>
+      </w:r>
+      <w:r>
+        <w:rPr>
+          <w:sz w:val="20"/>
+          <w:szCs w:val="20"/>
+          <w:rtl w:val="0"/>
+        </w:rPr>
+        <w:t xml:space="preserve"> of Louisville Mathematics, Louisville, KY</w:t>
         <w:tab/>
       </w:r>
       <w:r>

</xml_diff>